<commit_message>
Fix multi-PMID citation chips; align site copy with study findings
- Brief renderer: each PMID in "[PMID: a, PMID: b]" or "[PMID: a, b]" now
  becomes its own clickable chip (screen and .docx export); UNWITNESSED tags
  with trailing text ("[UNWITNESSED from these papers]") are now styled
- PubMed count 39M -> 41M (41,216,535 on 2026-09-28)
- Drop "Anthropic's most capable model"
- Replace claims that chatbots fabricate most citations, which the preprint's
  own audit did not find, with what it did find: sources come after the
  answer, untied to claims; AI Overviews cite mostly secondary web pages
- Regenerate preprint Figure 2 from the fixed interface

Co-Authored-By: Claude Opus 5.5 <noreply@anthropic.com>
Claude-Session: https://claude.ai/code/session_01JQfsE65jJYGB3K39S2FxEj
</commit_message>
<xml_diff>
--- a/preprint/Tables_Turned_preprint.docx
+++ b/preprint/Tables_Turned_preprint.docx
@@ -160,7 +160,7 @@
         </w:rPr>
         <w:t xml:space="preserve">* Correspondence: </w:t>
       </w:r>
-      <w:hyperlink w:history="1" r:id="rId2vi7nrrctl9qs3vajg4im">
+      <w:hyperlink w:history="1" r:id="rId_3cxw7iqrgnw8xjpzrjsh">
         <w:r>
           <w:rPr>
             <w:rFonts w:ascii="Times New Roman" w:cs="Times New Roman" w:eastAsia="Times New Roman" w:hAnsi="Times New Roman"/>
@@ -180,7 +180,7 @@
         </w:rPr>
         <w:t xml:space="preserve">   ·   Code, data and live tool: </w:t>
       </w:r>
-      <w:hyperlink w:history="1" r:id="rIdlofpfyir91nikvqcebpzj">
+      <w:hyperlink w:history="1" r:id="rIddm2n2ilhcgik3g3hkvu3m">
         <w:r>
           <w:rPr>
             <w:rFonts w:ascii="Times New Roman" w:cs="Times New Roman" w:eastAsia="Times New Roman" w:hAnsi="Times New Roman"/>
@@ -200,7 +200,7 @@
         </w:rPr>
         <w:t xml:space="preserve">  ·  </w:t>
       </w:r>
-      <w:hyperlink w:history="1" r:id="rIdqo7g-pey4h3h5v7un9lsk">
+      <w:hyperlink w:history="1" r:id="rIdvpxdifvczv0nbzckywxfi">
         <w:r>
           <w:rPr>
             <w:rFonts w:ascii="Times New Roman" w:cs="Times New Roman" w:eastAsia="Times New Roman" w:hAnsi="Times New Roman"/>
@@ -2303,7 +2303,7 @@
           <wp:inline distT="0" distB="0" distL="0" distR="0">
             <wp:extent cx="5943600" cy="2867025"/>
             <wp:effectExtent t="0" r="0" b="0" l="0"/>
-            <wp:docPr id="2" name="fig2_interface.png" descr="**Figure 2. The reader's view: the production interface, replaying the recorded Q1 session.** The screens come from the unmodified search.html driven headlessly, with every network response (strategies, PubMed results, summaries, and the streamed bri" title="fig2_interface.png"/>
+            <wp:docPr id="2" name="fig2_interface.png" descr="**Figure 2. The reader's view: the production interface, replaying the recorded Q1 session.** The screens come from the production search.html driven headlessly, with every network response (strategies, PubMed results, summaries, and the streamed bri" title="fig2_interface.png"/>
             <wp:cNvGraphicFramePr>
               <a:graphicFrameLocks xmlns:a="http://schemas.openxmlformats.org/drawingml/2006/main" noChangeAspect="1"/>
             </wp:cNvGraphicFramePr>
@@ -2362,7 +2362,7 @@
           <w:sz w:val="15"/>
           <w:szCs w:val="15"/>
         </w:rPr>
-        <w:t xml:space="preserve"> The screens come from the unmodified search.html driven headlessly, with every network response (strategies, PubMed results, summaries, and the streamed brief) replayed from the study's frozen data, so the page's own code performed the ranking and rendering. (a) The question and decision context. (b) Curation: each card shows the plain-language title and summary, the original title, first author, journal, year, a clickable PMID, and a strategy-agreement badge; the full abstract is expanded here for an adult-insomnia guideline, a paper a careful reader might deselect. (c) The brief, with each claim carrying its PMID receipt.</w:t>
+        <w:t xml:space="preserve"> The screens come from the production search.html driven headlessly, with every network response (strategies, PubMed results, summaries, and the streamed brief) replayed from the study's frozen data, so the page's own code performed the ranking and rendering. (a) The question and decision context. (b) Curation: each card shows the plain-language title and summary, the original title, first author, journal, year, a clickable PMID, and a strategy-agreement badge; the full abstract is expanded here for an adult-insomnia guideline, a paper a careful reader might deselect. (c) The brief, with each claim carrying its PMID receipt.</w:t>
       </w:r>
     </w:p>
     <w:p>
@@ -9998,7 +9998,7 @@
         </w:rPr>
         <w:t xml:space="preserve">Piwowar H, Priem J, Larivière V, Alperin JP, Matthias L, Norlander B, et al. The state of OA: a large-scale analysis of the prevalence and impact of Open Access articles. PeerJ. 2018;6:e4375. </w:t>
       </w:r>
-      <w:hyperlink w:history="1" r:id="rIdy96cczqmzcbkskdsvrdf1">
+      <w:hyperlink w:history="1" r:id="rIdobdtrziklctcfnikj_pj0">
         <w:r>
           <w:rPr>
             <w:rFonts w:ascii="Times New Roman" w:cs="Times New Roman" w:eastAsia="Times New Roman" w:hAnsi="Times New Roman"/>
@@ -10017,7 +10017,7 @@
         </w:rPr>
         <w:t xml:space="preserve">  </w:t>
       </w:r>
-      <w:hyperlink w:history="1" r:id="rIdyfnbt-8mxeybhxzi3161d">
+      <w:hyperlink w:history="1" r:id="rId9e06t97rpktjewf5kk5mv">
         <w:r>
           <w:rPr>
             <w:rFonts w:ascii="Times New Roman" w:cs="Times New Roman" w:eastAsia="Times New Roman" w:hAnsi="Times New Roman"/>
@@ -10136,7 +10136,7 @@
         </w:rPr>
         <w:t xml:space="preserve">Rooney MK, Santiago G, Perni S, Horowitz DP, McCall AR, Einstein AJ, et al. Readability of Patient Education Materials From High-Impact Medical Journals: A 20-Year Analysis. J Patient Exp. 2021;8:2374373521998847. </w:t>
       </w:r>
-      <w:hyperlink w:history="1" r:id="rIdl29mefxlqhrj7xgiyhskp">
+      <w:hyperlink w:history="1" r:id="rIdsgzq2cdsn97etoif6nlwu">
         <w:r>
           <w:rPr>
             <w:rFonts w:ascii="Times New Roman" w:cs="Times New Roman" w:eastAsia="Times New Roman" w:hAnsi="Times New Roman"/>
@@ -10155,7 +10155,7 @@
         </w:rPr>
         <w:t xml:space="preserve">  </w:t>
       </w:r>
-      <w:hyperlink w:history="1" r:id="rIdrsxtvb9mtz6pplt42cgad">
+      <w:hyperlink w:history="1" r:id="rIdsx1cxvn0lrtqgvav02sdc">
         <w:r>
           <w:rPr>
             <w:rFonts w:ascii="Times New Roman" w:cs="Times New Roman" w:eastAsia="Times New Roman" w:hAnsi="Times New Roman"/>
@@ -10220,7 +10220,7 @@
         </w:rPr>
         <w:t xml:space="preserve">Eysenbach G, Powell J, Kuss O, Sa ER. Empirical studies assessing the quality of health information for consumers on the world wide web: a systematic review. JAMA. 2002;287(20):2691-700. </w:t>
       </w:r>
-      <w:hyperlink w:history="1" r:id="rIdzyhyxufjiubwgqyozyxxi">
+      <w:hyperlink w:history="1" r:id="rId15txgpvn6nurxoabdxtnt">
         <w:r>
           <w:rPr>
             <w:rFonts w:ascii="Times New Roman" w:cs="Times New Roman" w:eastAsia="Times New Roman" w:hAnsi="Times New Roman"/>
@@ -10239,7 +10239,7 @@
         </w:rPr>
         <w:t xml:space="preserve">  </w:t>
       </w:r>
-      <w:hyperlink w:history="1" r:id="rIdw-ft2y7v1aolcilttxode">
+      <w:hyperlink w:history="1" r:id="rIdwjvbexafkj8bbtswiotki">
         <w:r>
           <w:rPr>
             <w:rFonts w:ascii="Times New Roman" w:cs="Times New Roman" w:eastAsia="Times New Roman" w:hAnsi="Times New Roman"/>
@@ -10277,7 +10277,7 @@
         </w:rPr>
         <w:t xml:space="preserve">Suarez-Lledo V, Alvarez-Galvez J. Prevalence of Health Misinformation on Social Media: Systematic Review. J Med Internet Res. 2021;23(1):e17187. </w:t>
       </w:r>
-      <w:hyperlink w:history="1" r:id="rIdqmvukbgc6eb9pzjsalgl4">
+      <w:hyperlink w:history="1" r:id="rIdhbw0bjrobhnpu11sh6t39">
         <w:r>
           <w:rPr>
             <w:rFonts w:ascii="Times New Roman" w:cs="Times New Roman" w:eastAsia="Times New Roman" w:hAnsi="Times New Roman"/>
@@ -10296,7 +10296,7 @@
         </w:rPr>
         <w:t xml:space="preserve">  </w:t>
       </w:r>
-      <w:hyperlink w:history="1" r:id="rIdedo2ektv02osr0qwprvrl">
+      <w:hyperlink w:history="1" r:id="rIdojfs-1a1apeflnsjlrzfy">
         <w:r>
           <w:rPr>
             <w:rFonts w:ascii="Times New Roman" w:cs="Times New Roman" w:eastAsia="Times New Roman" w:hAnsi="Times New Roman"/>
@@ -10415,7 +10415,7 @@
         </w:rPr>
         <w:t xml:space="preserve">Singhal K, Azizi S, Tu T, Mahdavi SS, Wei J, Chung HW, et al. Large language models encode clinical knowledge. Nature. 2023;620(7972):172-180. </w:t>
       </w:r>
-      <w:hyperlink w:history="1" r:id="rIdxyuisq83sfsqqiae9v1zq">
+      <w:hyperlink w:history="1" r:id="rIde5hkiojtysfqvtbagk3s3">
         <w:r>
           <w:rPr>
             <w:rFonts w:ascii="Times New Roman" w:cs="Times New Roman" w:eastAsia="Times New Roman" w:hAnsi="Times New Roman"/>
@@ -10434,7 +10434,7 @@
         </w:rPr>
         <w:t xml:space="preserve">  </w:t>
       </w:r>
-      <w:hyperlink w:history="1" r:id="rId6tzc0nz5dgysubafx0oah">
+      <w:hyperlink w:history="1" r:id="rId3n6azziqed4bhd-icmdac">
         <w:r>
           <w:rPr>
             <w:rFonts w:ascii="Times New Roman" w:cs="Times New Roman" w:eastAsia="Times New Roman" w:hAnsi="Times New Roman"/>
@@ -10472,7 +10472,7 @@
         </w:rPr>
         <w:t xml:space="preserve">Ayers JW, Poliak A, Dredze M, Leas EC, Zhu Z, Kelley JB, et al. Comparing Physician and Artificial Intelligence Chatbot Responses to Patient Questions Posted to a Public Social Media Forum. JAMA Intern Med. 2023;183(6):589-596. </w:t>
       </w:r>
-      <w:hyperlink w:history="1" r:id="rIdsa-vwfp4cid2e13oezjh9">
+      <w:hyperlink w:history="1" r:id="rIdqsxjwtlmijyapd7ujpfkr">
         <w:r>
           <w:rPr>
             <w:rFonts w:ascii="Times New Roman" w:cs="Times New Roman" w:eastAsia="Times New Roman" w:hAnsi="Times New Roman"/>
@@ -10491,7 +10491,7 @@
         </w:rPr>
         <w:t xml:space="preserve">  </w:t>
       </w:r>
-      <w:hyperlink w:history="1" r:id="rIdynxu59tswere4vyajpyde">
+      <w:hyperlink w:history="1" r:id="rIdg94ytb949pgx9qvgae8lc">
         <w:r>
           <w:rPr>
             <w:rFonts w:ascii="Times New Roman" w:cs="Times New Roman" w:eastAsia="Times New Roman" w:hAnsi="Times New Roman"/>
@@ -10529,7 +10529,7 @@
         </w:rPr>
         <w:t xml:space="preserve">Walters WH, Wilder EI. Fabrication and errors in the bibliographic citations generated by ChatGPT. Sci Rep. 2023;13(1):14045. </w:t>
       </w:r>
-      <w:hyperlink w:history="1" r:id="rId5fhgii_kcqktrg_ht6aut">
+      <w:hyperlink w:history="1" r:id="rIdmuti13jeutvdmih7aqpaa">
         <w:r>
           <w:rPr>
             <w:rFonts w:ascii="Times New Roman" w:cs="Times New Roman" w:eastAsia="Times New Roman" w:hAnsi="Times New Roman"/>
@@ -10548,7 +10548,7 @@
         </w:rPr>
         <w:t xml:space="preserve">  </w:t>
       </w:r>
-      <w:hyperlink w:history="1" r:id="rIdhoipy7ycjm6ng0wwauonc">
+      <w:hyperlink w:history="1" r:id="rIdse92duljispnhh-wmnb-l">
         <w:r>
           <w:rPr>
             <w:rFonts w:ascii="Times New Roman" w:cs="Times New Roman" w:eastAsia="Times New Roman" w:hAnsi="Times New Roman"/>
@@ -10586,7 +10586,7 @@
         </w:rPr>
         <w:t xml:space="preserve">Bhattacharyya M, Miller VM, Bhattacharyya D, Miller LE. High Rates of Fabricated and Inaccurate References in ChatGPT-Generated Medical Content. Cureus. 2023;15(5):e39238. </w:t>
       </w:r>
-      <w:hyperlink w:history="1" r:id="rIduxpyph43opokjctnm9y_1">
+      <w:hyperlink w:history="1" r:id="rIdg5sctr1tr6lej-g-rpxf_">
         <w:r>
           <w:rPr>
             <w:rFonts w:ascii="Times New Roman" w:cs="Times New Roman" w:eastAsia="Times New Roman" w:hAnsi="Times New Roman"/>
@@ -10605,7 +10605,7 @@
         </w:rPr>
         <w:t xml:space="preserve">  </w:t>
       </w:r>
-      <w:hyperlink w:history="1" r:id="rIdeusldlndmrnisx0r_k_np">
+      <w:hyperlink w:history="1" r:id="rIdbnkysah91hnyezeqad7dt">
         <w:r>
           <w:rPr>
             <w:rFonts w:ascii="Times New Roman" w:cs="Times New Roman" w:eastAsia="Times New Roman" w:hAnsi="Times New Roman"/>
@@ -10643,7 +10643,7 @@
         </w:rPr>
         <w:t xml:space="preserve">Alkaissi H, McFarlane SI. Artificial Hallucinations in ChatGPT: Implications in Scientific Writing. Cureus. 2023;15(2):e35179. </w:t>
       </w:r>
-      <w:hyperlink w:history="1" r:id="rIdvwfxtksqc_oxbqkkve8bq">
+      <w:hyperlink w:history="1" r:id="rId2b5xei5z03i3hxvl1hhlk">
         <w:r>
           <w:rPr>
             <w:rFonts w:ascii="Times New Roman" w:cs="Times New Roman" w:eastAsia="Times New Roman" w:hAnsi="Times New Roman"/>
@@ -10662,7 +10662,7 @@
         </w:rPr>
         <w:t xml:space="preserve">  </w:t>
       </w:r>
-      <w:hyperlink w:history="1" r:id="rIdmenmagbmwx7anvi2fgjih">
+      <w:hyperlink w:history="1" r:id="rIdlpxzdf7w-yy5bafbcjvkk">
         <w:r>
           <w:rPr>
             <w:rFonts w:ascii="Times New Roman" w:cs="Times New Roman" w:eastAsia="Times New Roman" w:hAnsi="Times New Roman"/>
@@ -10700,7 +10700,7 @@
         </w:rPr>
         <w:t xml:space="preserve">Omiye JA, Lester JC, Spichak S, Rotemberg V, Daneshjou R. Large language models propagate race-based medicine. NPJ Digit Med. 2023;6(1):195. </w:t>
       </w:r>
-      <w:hyperlink w:history="1" r:id="rIdkhthe6vstedyce1ickygh">
+      <w:hyperlink w:history="1" r:id="rId2kpjahhtjjqqtkmg8nnt8">
         <w:r>
           <w:rPr>
             <w:rFonts w:ascii="Times New Roman" w:cs="Times New Roman" w:eastAsia="Times New Roman" w:hAnsi="Times New Roman"/>
@@ -10719,7 +10719,7 @@
         </w:rPr>
         <w:t xml:space="preserve">  </w:t>
       </w:r>
-      <w:hyperlink w:history="1" r:id="rIdlv0rccxnm0h-krvbuudil">
+      <w:hyperlink w:history="1" r:id="rId3yqtr5vditk5y-tqh0ckv">
         <w:r>
           <w:rPr>
             <w:rFonts w:ascii="Times New Roman" w:cs="Times New Roman" w:eastAsia="Times New Roman" w:hAnsi="Times New Roman"/>
@@ -10757,7 +10757,7 @@
         </w:rPr>
         <w:t xml:space="preserve">Chen S, Kann BH, Foote MB, Aerts HJWL, Savova GK, Mak RH, et al. Use of Artificial Intelligence Chatbots for Cancer Treatment Information. JAMA Oncol. 2023;9(10):1459-1462. </w:t>
       </w:r>
-      <w:hyperlink w:history="1" r:id="rIdqtcm0z5smgkaswyux0zqw">
+      <w:hyperlink w:history="1" r:id="rIdojhh9m084j0qecvh4dfm8">
         <w:r>
           <w:rPr>
             <w:rFonts w:ascii="Times New Roman" w:cs="Times New Roman" w:eastAsia="Times New Roman" w:hAnsi="Times New Roman"/>
@@ -10776,7 +10776,7 @@
         </w:rPr>
         <w:t xml:space="preserve">  </w:t>
       </w:r>
-      <w:hyperlink w:history="1" r:id="rIdxhf23rhtwxaida1z_ar2p">
+      <w:hyperlink w:history="1" r:id="rIddrewmgmas1k89yy2mphtq">
         <w:r>
           <w:rPr>
             <w:rFonts w:ascii="Times New Roman" w:cs="Times New Roman" w:eastAsia="Times New Roman" w:hAnsi="Times New Roman"/>
@@ -10841,7 +10841,7 @@
         </w:rPr>
         <w:t xml:space="preserve">Wu K, Wu E, Wei K, Zhang A, Casasola A, Nguyen T, et al. An automated framework for assessing how well LLMs cite relevant medical references. Nat Commun. 2025;16(1):3615. </w:t>
       </w:r>
-      <w:hyperlink w:history="1" r:id="rIdrqtuo9a5dm7lqycjwonxj">
+      <w:hyperlink w:history="1" r:id="rIdd9ors1heo6nppy1ewombq">
         <w:r>
           <w:rPr>
             <w:rFonts w:ascii="Times New Roman" w:cs="Times New Roman" w:eastAsia="Times New Roman" w:hAnsi="Times New Roman"/>
@@ -10860,7 +10860,7 @@
         </w:rPr>
         <w:t xml:space="preserve">  </w:t>
       </w:r>
-      <w:hyperlink w:history="1" r:id="rIdjohjpprkotibi7mwcgxpy">
+      <w:hyperlink w:history="1" r:id="rId4g1esrepwgijpy01uchej">
         <w:r>
           <w:rPr>
             <w:rFonts w:ascii="Times New Roman" w:cs="Times New Roman" w:eastAsia="Times New Roman" w:hAnsi="Times New Roman"/>
@@ -10979,7 +10979,7 @@
         </w:rPr>
         <w:t xml:space="preserve">Zakka C, Shad R, Chaurasia A, Dalal AR, Kim JL, Moor M, et al. Almanac - Retrieval-Augmented Language Models for Clinical Medicine. NEJM AI. 2024;1(2). </w:t>
       </w:r>
-      <w:hyperlink w:history="1" r:id="rIdyefuzdfcc9frtv2ykooig">
+      <w:hyperlink w:history="1" r:id="rIdcmwxt_yrp-is9e4_mxwwe">
         <w:r>
           <w:rPr>
             <w:rFonts w:ascii="Times New Roman" w:cs="Times New Roman" w:eastAsia="Times New Roman" w:hAnsi="Times New Roman"/>
@@ -10998,7 +10998,7 @@
         </w:rPr>
         <w:t xml:space="preserve">  </w:t>
       </w:r>
-      <w:hyperlink w:history="1" r:id="rIdbetfqyw18bjhnni1jdk_-">
+      <w:hyperlink w:history="1" r:id="rIdh56xap-pxlzivhziceryt">
         <w:r>
           <w:rPr>
             <w:rFonts w:ascii="Times New Roman" w:cs="Times New Roman" w:eastAsia="Times New Roman" w:hAnsi="Times New Roman"/>
@@ -11036,7 +11036,7 @@
         </w:rPr>
         <w:t xml:space="preserve">Jin Q, Leaman R, Lu Z. PubMed and beyond: biomedical literature search in the age of artificial intelligence. EBioMedicine. 2024;100:104988. </w:t>
       </w:r>
-      <w:hyperlink w:history="1" r:id="rIdbteyz7ymjqjv8xiy8bo1a">
+      <w:hyperlink w:history="1" r:id="rIduxwph8kxfhondgexoe4to">
         <w:r>
           <w:rPr>
             <w:rFonts w:ascii="Times New Roman" w:cs="Times New Roman" w:eastAsia="Times New Roman" w:hAnsi="Times New Roman"/>
@@ -11055,7 +11055,7 @@
         </w:rPr>
         <w:t xml:space="preserve">  </w:t>
       </w:r>
-      <w:hyperlink w:history="1" r:id="rIdfh9j1u1gtmyvzzj2aucyl">
+      <w:hyperlink w:history="1" r:id="rIdthh7ppzyfx6ckdlid_7gv">
         <w:r>
           <w:rPr>
             <w:rFonts w:ascii="Times New Roman" w:cs="Times New Roman" w:eastAsia="Times New Roman" w:hAnsi="Times New Roman"/>
@@ -11093,7 +11093,7 @@
         </w:rPr>
         <w:t xml:space="preserve">Fiorini N, Canese K, Starchenko G, Kireev E, Kim W, Miller V, et al. Best Match: New relevance search for PubMed. PLoS Biol. 2018;16(8):e2005343. </w:t>
       </w:r>
-      <w:hyperlink w:history="1" r:id="rIdgklppx3u7s4_pan45lizk">
+      <w:hyperlink w:history="1" r:id="rId_j0mcgdn6vnhaf4y5efj4">
         <w:r>
           <w:rPr>
             <w:rFonts w:ascii="Times New Roman" w:cs="Times New Roman" w:eastAsia="Times New Roman" w:hAnsi="Times New Roman"/>
@@ -11112,7 +11112,7 @@
         </w:rPr>
         <w:t xml:space="preserve">  </w:t>
       </w:r>
-      <w:hyperlink w:history="1" r:id="rIdkuchzn55ysiudbbebvqq4">
+      <w:hyperlink w:history="1" r:id="rIdh0mmckz2nfdpxtbytw6_l">
         <w:r>
           <w:rPr>
             <w:rFonts w:ascii="Times New Roman" w:cs="Times New Roman" w:eastAsia="Times New Roman" w:hAnsi="Times New Roman"/>
@@ -11158,7 +11158,7 @@
         </w:rPr>
         <w:t xml:space="preserve"/>
       </w:r>
-      <w:hyperlink w:history="1" r:id="rIdb-vbbt7wysovvwe2gikll">
+      <w:hyperlink w:history="1" r:id="rIdypok-hao1uqu2pmjdef1i">
         <w:r>
           <w:rPr>
             <w:rFonts w:ascii="Times New Roman" w:cs="Times New Roman" w:eastAsia="Times New Roman" w:hAnsi="Times New Roman"/>
@@ -11277,7 +11277,7 @@
         </w:rPr>
         <w:t xml:space="preserve">Parasuraman R, Manzey DH. Complacency and bias in human use of automation: an attentional integration. Hum Factors. 2010;52(3):381-410. </w:t>
       </w:r>
-      <w:hyperlink w:history="1" r:id="rIduycmhdcckijx79qukssu_">
+      <w:hyperlink w:history="1" r:id="rIdqimmvecpiv1zwin60fs2y">
         <w:r>
           <w:rPr>
             <w:rFonts w:ascii="Times New Roman" w:cs="Times New Roman" w:eastAsia="Times New Roman" w:hAnsi="Times New Roman"/>
@@ -11296,7 +11296,7 @@
         </w:rPr>
         <w:t xml:space="preserve">  </w:t>
       </w:r>
-      <w:hyperlink w:history="1" r:id="rIdd8dmokszs4vw4yrndmkw7">
+      <w:hyperlink w:history="1" r:id="rId4orwnkmhu7lsj9xwwsrff">
         <w:r>
           <w:rPr>
             <w:rFonts w:ascii="Times New Roman" w:cs="Times New Roman" w:eastAsia="Times New Roman" w:hAnsi="Times New Roman"/>
@@ -11334,7 +11334,7 @@
         </w:rPr>
         <w:t xml:space="preserve">Goddard K, Roudsari A, Wyatt JC. Automation bias: a systematic review of frequency, effect mediators, and mitigators. J Am Med Inform Assoc. 2012;19(1):121-7. </w:t>
       </w:r>
-      <w:hyperlink w:history="1" r:id="rIdlz7q2zqxfkxdccxremc5i">
+      <w:hyperlink w:history="1" r:id="rIdcjgwa54mttyq41na47x44">
         <w:r>
           <w:rPr>
             <w:rFonts w:ascii="Times New Roman" w:cs="Times New Roman" w:eastAsia="Times New Roman" w:hAnsi="Times New Roman"/>
@@ -11353,7 +11353,7 @@
         </w:rPr>
         <w:t xml:space="preserve">  </w:t>
       </w:r>
-      <w:hyperlink w:history="1" r:id="rIdqiqdwms_5rigkinkpdahm">
+      <w:hyperlink w:history="1" r:id="rIdsotqvbzdmijs-i5iswd5y">
         <w:r>
           <w:rPr>
             <w:rFonts w:ascii="Times New Roman" w:cs="Times New Roman" w:eastAsia="Times New Roman" w:hAnsi="Times New Roman"/>
@@ -11418,7 +11418,7 @@
         </w:rPr>
         <w:t xml:space="preserve">Bruni O, Breda M, Nobili L, Fietze I, Capdevila ORS, Gronfier C. European expert guidance on management of sleep onset insomnia and melatonin use in typically developing children. Eur J Pediatr. 2024;183(7):2955-2964. </w:t>
       </w:r>
-      <w:hyperlink w:history="1" r:id="rIds48u0lgyd8njfynwisrqo">
+      <w:hyperlink w:history="1" r:id="rIdksocqb9snfkkvgujky7jv">
         <w:r>
           <w:rPr>
             <w:rFonts w:ascii="Times New Roman" w:cs="Times New Roman" w:eastAsia="Times New Roman" w:hAnsi="Times New Roman"/>
@@ -11437,7 +11437,7 @@
         </w:rPr>
         <w:t xml:space="preserve">  </w:t>
       </w:r>
-      <w:hyperlink w:history="1" r:id="rIdviwwh-czcapsylexflnb9">
+      <w:hyperlink w:history="1" r:id="rId7tpitiuqdcfxlg7hf3tqd">
         <w:r>
           <w:rPr>
             <w:rFonts w:ascii="Times New Roman" w:cs="Times New Roman" w:eastAsia="Times New Roman" w:hAnsi="Times New Roman"/>
@@ -11556,7 +11556,7 @@
         </w:rPr>
         <w:t xml:space="preserve">Gringras P, Nir T, Breddy J, Frydman-Marom A, Findling RL. Efficacy and Safety of Pediatric Prolonged-Release Melatonin for Insomnia in Children With Autism Spectrum Disorder. J Am Acad Child Adolesc Psychiatry. 2017;56(11):948-957.e4. </w:t>
       </w:r>
-      <w:hyperlink w:history="1" r:id="rIdkzircnglrobea7rpikodn">
+      <w:hyperlink w:history="1" r:id="rId_bwtgg-7r4dffhd6w7bnf">
         <w:r>
           <w:rPr>
             <w:rFonts w:ascii="Times New Roman" w:cs="Times New Roman" w:eastAsia="Times New Roman" w:hAnsi="Times New Roman"/>
@@ -11575,7 +11575,7 @@
         </w:rPr>
         <w:t xml:space="preserve">  </w:t>
       </w:r>
-      <w:hyperlink w:history="1" r:id="rIdfetuvriitcv8hoonufk8f">
+      <w:hyperlink w:history="1" r:id="rIdzcnbcgojpxppttwgzx7tc">
         <w:r>
           <w:rPr>
             <w:rFonts w:ascii="Times New Roman" w:cs="Times New Roman" w:eastAsia="Times New Roman" w:hAnsi="Times New Roman"/>
@@ -11613,7 +11613,7 @@
         </w:rPr>
         <w:t xml:space="preserve">Choi K, Lee YJ, Park S, Je NK, Suh HS. Efficacy of melatonin for chronic insomnia: Systematic reviews and meta-analyses. Sleep Med Rev. 2022;66:101692. </w:t>
       </w:r>
-      <w:hyperlink w:history="1" r:id="rIdifkkd8-eqtl7o4gslhxfw">
+      <w:hyperlink w:history="1" r:id="rIdi3jnogaef8wqj2tmnhdin">
         <w:r>
           <w:rPr>
             <w:rFonts w:ascii="Times New Roman" w:cs="Times New Roman" w:eastAsia="Times New Roman" w:hAnsi="Times New Roman"/>
@@ -11632,7 +11632,7 @@
         </w:rPr>
         <w:t xml:space="preserve">  </w:t>
       </w:r>
-      <w:hyperlink w:history="1" r:id="rIdoqpq1vpdrisxomrniaf7m">
+      <w:hyperlink w:history="1" r:id="rIdz9sa4j1gzkxahzx2obrau">
         <w:r>
           <w:rPr>
             <w:rFonts w:ascii="Times New Roman" w:cs="Times New Roman" w:eastAsia="Times New Roman" w:hAnsi="Times New Roman"/>
@@ -11670,7 +11670,7 @@
         </w:rPr>
         <w:t xml:space="preserve">Malow BA, Findling RL, Schroder CM, Maras A, Breddy J, Nir T, et al. Sleep, Growth, and Puberty After 2 Years of Prolonged-Release Melatonin in Children With Autism Spectrum Disorder. J Am Acad Child Adolesc Psychiatry. 2021;60(2):252-261.e3. </w:t>
       </w:r>
-      <w:hyperlink w:history="1" r:id="rIdcfnuvy7uuznk3tp60jj55">
+      <w:hyperlink w:history="1" r:id="rIdnwargbmrtp7nnks4x_nmi">
         <w:r>
           <w:rPr>
             <w:rFonts w:ascii="Times New Roman" w:cs="Times New Roman" w:eastAsia="Times New Roman" w:hAnsi="Times New Roman"/>
@@ -11689,7 +11689,7 @@
         </w:rPr>
         <w:t xml:space="preserve">  </w:t>
       </w:r>
-      <w:hyperlink w:history="1" r:id="rIdp05g8hia87zr8zlgpwvlq">
+      <w:hyperlink w:history="1" r:id="rIdpnpxhwqx_-gptoq6nnzlz">
         <w:r>
           <w:rPr>
             <w:rFonts w:ascii="Times New Roman" w:cs="Times New Roman" w:eastAsia="Times New Roman" w:hAnsi="Times New Roman"/>
@@ -11727,7 +11727,7 @@
         </w:rPr>
         <w:t xml:space="preserve">Cohen PA, Avula B, Wang YH, Katragunta K, Khan I. Quantity of Melatonin and CBD in Melatonin Gummies Sold in the US. JAMA. 2023;329(16):1401-1402. </w:t>
       </w:r>
-      <w:hyperlink w:history="1" r:id="rIdmjqxqts7rzaj-cktk6wfl">
+      <w:hyperlink w:history="1" r:id="rIds9sozqcc-5wr6zw1r7alh">
         <w:r>
           <w:rPr>
             <w:rFonts w:ascii="Times New Roman" w:cs="Times New Roman" w:eastAsia="Times New Roman" w:hAnsi="Times New Roman"/>
@@ -11746,7 +11746,7 @@
         </w:rPr>
         <w:t xml:space="preserve">  </w:t>
       </w:r>
-      <w:hyperlink w:history="1" r:id="rIdb4c587zyhcc3_dltns4yk">
+      <w:hyperlink w:history="1" r:id="rIdgszug6apbfgvwd64lpcmg">
         <w:r>
           <w:rPr>
             <w:rFonts w:ascii="Times New Roman" w:cs="Times New Roman" w:eastAsia="Times New Roman" w:hAnsi="Times New Roman"/>
@@ -11784,7 +11784,7 @@
         </w:rPr>
         <w:t xml:space="preserve">Abou-Khalil R, Andary J, El-Hayek E. Apple cider vinegar for weight management in Lebanese adolescents and young adults with overweight and obesity: a randomised, double-blind, placebo-controlled study. BMJ Nutr Prev Health. 2024;7(1):61-67. [Retracted] </w:t>
       </w:r>
-      <w:hyperlink w:history="1" r:id="rIdnsy2ptcj1k6itpsc8ex_b">
+      <w:hyperlink w:history="1" r:id="rIdgvtkgkqjbjn2kdog7v0fc">
         <w:r>
           <w:rPr>
             <w:rFonts w:ascii="Times New Roman" w:cs="Times New Roman" w:eastAsia="Times New Roman" w:hAnsi="Times New Roman"/>
@@ -11803,7 +11803,7 @@
         </w:rPr>
         <w:t xml:space="preserve">  </w:t>
       </w:r>
-      <w:hyperlink w:history="1" r:id="rIdgvxsr0ssvl-1rjryh2ypp">
+      <w:hyperlink w:history="1" r:id="rIdzdyida5zkmq1k6mcc6uyw">
         <w:r>
           <w:rPr>
             <w:rFonts w:ascii="Times New Roman" w:cs="Times New Roman" w:eastAsia="Times New Roman" w:hAnsi="Times New Roman"/>
@@ -11841,7 +11841,7 @@
         </w:rPr>
         <w:t xml:space="preserve">Guyatt GH, Oxman AD, Vist GE, Kunz R, Falck-Ytter Y, Alonso-Coello P, et al. GRADE: an emerging consensus on rating quality of evidence and strength of recommendations. BMJ. 2008;336(7650):924-6. </w:t>
       </w:r>
-      <w:hyperlink w:history="1" r:id="rIdgk_84d5dwur1kwmqejklv">
+      <w:hyperlink w:history="1" r:id="rId4rchu_txrhmkswdqd70k3">
         <w:r>
           <w:rPr>
             <w:rFonts w:ascii="Times New Roman" w:cs="Times New Roman" w:eastAsia="Times New Roman" w:hAnsi="Times New Roman"/>
@@ -11860,7 +11860,7 @@
         </w:rPr>
         <w:t xml:space="preserve">  </w:t>
       </w:r>
-      <w:hyperlink w:history="1" r:id="rIdwfcjmvm--w9fg6gkqjukx">
+      <w:hyperlink w:history="1" r:id="rIdoduwxnjk2fp6pqcb5bpcp">
         <w:r>
           <w:rPr>
             <w:rFonts w:ascii="Times New Roman" w:cs="Times New Roman" w:eastAsia="Times New Roman" w:hAnsi="Times New Roman"/>

</xml_diff>